<commit_message>
report: embed architecture diagrams (Figures 1–3) into master TRINITY report
</commit_message>
<xml_diff>
--- a/outputs/goc/Project_TRINITY_Master_Report.docx
+++ b/outputs/goc/Project_TRINITY_Master_Report.docx
@@ -818,6 +818,51 @@
       </w:r>
     </w:p>
     <w:p>
+      <w:r>
+        <w:t>Figure 2: SIA model family — one AI OS, four hardware tiers, one shared stack.</w:t>
+      </w:r>
+    </w:p>
+    <w:p>
+      <w:pPr>
+        <w:jc w:val="center"/>
+      </w:pPr>
+      <w:r>
+        <w:drawing>
+          <wp:inline xmlns:a="http://schemas.openxmlformats.org/drawingml/2006/main" xmlns:pic="http://schemas.openxmlformats.org/drawingml/2006/picture">
+            <wp:extent cx="5760720" cy="4800600"/>
+            <wp:docPr id="1" name="Picture 1"/>
+            <wp:cNvGraphicFramePr>
+              <a:graphicFrameLocks noChangeAspect="1"/>
+            </wp:cNvGraphicFramePr>
+            <a:graphic>
+              <a:graphicData uri="http://schemas.openxmlformats.org/drawingml/2006/picture">
+                <pic:pic>
+                  <pic:nvPicPr>
+                    <pic:cNvPr id="0" name="02_sia_model_family.png"/>
+                    <pic:cNvPicPr/>
+                  </pic:nvPicPr>
+                  <pic:blipFill>
+                    <a:blip r:embed="rId9"/>
+                    <a:stretch>
+                      <a:fillRect/>
+                    </a:stretch>
+                  </pic:blipFill>
+                  <pic:spPr>
+                    <a:xfrm>
+                      <a:off x="0" y="0"/>
+                      <a:ext cx="5760720" cy="4800600"/>
+                    </a:xfrm>
+                    <a:prstGeom prst="rect"/>
+                  </pic:spPr>
+                </pic:pic>
+              </a:graphicData>
+            </a:graphic>
+          </wp:inline>
+        </w:drawing>
+      </w:r>
+    </w:p>
+    <w:p/>
+    <w:p>
       <w:pPr>
         <w:pStyle w:val="Heading1"/>
       </w:pPr>
@@ -1283,6 +1328,96 @@
         <w:t>Target verticals: healthcare, education, agriculture, manufacturing, defence, space, government, consumer AI.</w:t>
       </w:r>
     </w:p>
+    <w:p>
+      <w:r>
+        <w:t>Figure 1: The 5-Layer AI stack — coding agents to chip + energy.</w:t>
+      </w:r>
+    </w:p>
+    <w:p>
+      <w:pPr>
+        <w:jc w:val="center"/>
+      </w:pPr>
+      <w:r>
+        <w:drawing>
+          <wp:inline xmlns:a="http://schemas.openxmlformats.org/drawingml/2006/main" xmlns:pic="http://schemas.openxmlformats.org/drawingml/2006/picture">
+            <wp:extent cx="5760720" cy="4800600"/>
+            <wp:docPr id="2" name="Picture 2"/>
+            <wp:cNvGraphicFramePr>
+              <a:graphicFrameLocks noChangeAspect="1"/>
+            </wp:cNvGraphicFramePr>
+            <a:graphic>
+              <a:graphicData uri="http://schemas.openxmlformats.org/drawingml/2006/picture">
+                <pic:pic>
+                  <pic:nvPicPr>
+                    <pic:cNvPr id="0" name="01_5layer_ai_stack.png"/>
+                    <pic:cNvPicPr/>
+                  </pic:nvPicPr>
+                  <pic:blipFill>
+                    <a:blip r:embed="rId10"/>
+                    <a:stretch>
+                      <a:fillRect/>
+                    </a:stretch>
+                  </pic:blipFill>
+                  <pic:spPr>
+                    <a:xfrm>
+                      <a:off x="0" y="0"/>
+                      <a:ext cx="5760720" cy="4800600"/>
+                    </a:xfrm>
+                    <a:prstGeom prst="rect"/>
+                  </pic:spPr>
+                </pic:pic>
+              </a:graphicData>
+            </a:graphic>
+          </wp:inline>
+        </w:drawing>
+      </w:r>
+    </w:p>
+    <w:p/>
+    <w:p>
+      <w:r>
+        <w:t>Figure 3: SIA memory / agent / tool loop with DPDP privacy boundary.</w:t>
+      </w:r>
+    </w:p>
+    <w:p>
+      <w:pPr>
+        <w:jc w:val="center"/>
+      </w:pPr>
+      <w:r>
+        <w:drawing>
+          <wp:inline xmlns:a="http://schemas.openxmlformats.org/drawingml/2006/main" xmlns:pic="http://schemas.openxmlformats.org/drawingml/2006/picture">
+            <wp:extent cx="5760720" cy="4800600"/>
+            <wp:docPr id="3" name="Picture 3"/>
+            <wp:cNvGraphicFramePr>
+              <a:graphicFrameLocks noChangeAspect="1"/>
+            </wp:cNvGraphicFramePr>
+            <a:graphic>
+              <a:graphicData uri="http://schemas.openxmlformats.org/drawingml/2006/picture">
+                <pic:pic>
+                  <pic:nvPicPr>
+                    <pic:cNvPr id="0" name="03_memory-agents-loop.png"/>
+                    <pic:cNvPicPr/>
+                  </pic:nvPicPr>
+                  <pic:blipFill>
+                    <a:blip r:embed="rId11"/>
+                    <a:stretch>
+                      <a:fillRect/>
+                    </a:stretch>
+                  </pic:blipFill>
+                  <pic:spPr>
+                    <a:xfrm>
+                      <a:off x="0" y="0"/>
+                      <a:ext cx="5760720" cy="4800600"/>
+                    </a:xfrm>
+                    <a:prstGeom prst="rect"/>
+                  </pic:spPr>
+                </pic:pic>
+              </a:graphicData>
+            </a:graphic>
+          </wp:inline>
+        </w:drawing>
+      </w:r>
+    </w:p>
+    <w:p/>
     <w:p>
       <w:pPr>
         <w:pStyle w:val="Heading1"/>

</xml_diff>